<commit_message>
Correct final display rounding and pin complete revised CSPG4 archive in author-review documents
</commit_message>
<xml_diff>
--- a/research/release-candidates/cspg4-presubmission-20260921/journal-package/CSPG4-manuscript.docx
+++ b/research/release-candidates/cspg4-presubmission-20260921/journal-package/CSPG4-manuscript.docx
@@ -255,7 +255,7 @@
         <w:rPr>
           <w:b w:val="0"/>
         </w:rPr>
-        <w:t>We retained the original 11-gene panel, specimen exclusions and array-probe mappings.[6,4] The panel comprised CD276, SSTR2, PRAME, FAP, CD248, CSPG4, MSLN, L1CAM, GPC3, ALPP and CDH17. CHRNA6 was analyzed separately. The earlier panel and operational selection rule were frozen before inspecting the new cohort's target values; this was not public preregistration. The broader reference and external characterization reported here were documented on 19 September 2026 after earlier results were known. They are exploratory extensions, not prospectively independent discovery analyses. A dated 21 September amendment specified bootstrap intervals and one broader reference sensitivity before their computation, in response to a pre-submission review; these additions are also exploratory.</w:t>
+        <w:t>We retained the original 11-gene panel, specimen exclusions and array-probe mappings.[4,6] The panel comprised CD276, SSTR2, PRAME, FAP, CD248, CSPG4, MSLN, L1CAM, GPC3, ALPP and CDH17. CHRNA6 was analyzed separately. The earlier panel and operational selection rule were frozen before inspecting the new cohort's target values; this was not public preregistration. The broader reference and external characterization reported here were documented on 19 September 2026 after earlier results were known. They are exploratory extensions, not prospectively independent discovery analyses. A dated 21 September amendment specified bootstrap intervals and one broader reference sensitivity before their computation, in response to a pre-submission review; these additions are also exploratory.</w:t>
       </w:r>
     </w:p>
     <w:p>
@@ -637,7 +637,7 @@
         <w:rPr>
           <w:b w:val="0"/>
         </w:rPr>
-        <w:t xml:space="preserve"> The original Hofvander data are available through https://doi.org/10.5281/zenodo.17866629. Original array data and annotations are available as GEO GSE24369 and GPL6244. Additional inputs are Treehouse Tumor Compendium 25.01, Boudin et al. Supplementary Table S8, GEO GSE213065 and GSE234092, and OpenPedCan v15. The revision’s data and code package, including exact source URLs, selection ledgers, digests and specimen values, is available at https://github.com/trimcrae/Rare-cancers/blob/215b604ee9c6ed3325b3cee0b17085133cb093f8/research/release-candidates/cspg4-presubmission-20260921/CSPG4-data-code.zip. The original reproducibility archive remains at https://assets-eu.researchsquare.com/files/rs-10959636/v1/b95606f3a3799c60c8ac4434.zip. That historical archive does not contain the new expanded analyses. Source-specific attribution and reuse terms continue to apply.</w:t>
+        <w:t xml:space="preserve"> The original Hofvander data are available through https://doi.org/10.5281/zenodo.17866629. Original array data and annotations are available as GEO GSE24369 and GPL6244. Additional inputs are Treehouse Tumor Compendium 25.01, Boudin et al. Supplementary Table S8, GEO GSE213065 and GSE234092, and OpenPedCan v15. The revision’s data and code package, including exact source URLs, selection ledgers, digests and specimen values, is available at https://github.com/trimcrae/Rare-cancers/blob/1f9f087e2dd666f721bed6c20b8b64d72203c12e/research/release-candidates/cspg4-presubmission-20260921/CSPG4-data-code.zip. The original reproducibility archive remains at https://assets-eu.researchsquare.com/files/rs-10959636/v1/b95606f3a3799c60c8ac4434.zip. That historical archive does not contain the new expanded analyses. Source-specific attribution and reuse terms continue to apply.</w:t>
       </w:r>
     </w:p>
     <w:p>

</xml_diff>